<commit_message>
R8: rewrite comprehension section against Chen (2017) full text
Co-Authored-By: Claude Opus 5.5 <noreply@anthropic.com>
Claude-Session: https://claude.ai/code/session_01Q96WePso3R7jviE8KBARip
</commit_message>
<xml_diff>
--- a/drafts/Introduction_R8_APA.docx
+++ b/drafts/Introduction_R8_APA.docx
@@ -856,7 +856,7 @@
           <w:sz w:val="24"/>
           <w:szCs w:val="24"/>
         </w:rPr>
-        <w:t xml:space="preserve">Comprehension studies of RVCs and V1s present events with or without the result and ask children to judge perfective descriptions of them. Mandarin-speaking children show early sensitivity to the association between the perfective marker </w:t>
+        <w:t xml:space="preserve">Children need to learn that an RVC describes an action that brings about the result expressed by V2, and that the corresponding V1 can describe the action even when that result is absent. Comprehension studies examine this by showing events with or without the result and asking children to judge perfective sentences containing an RVC or its V1. Mandarin-speaking children show early sensitivity to the association between the perfective marker </w:t>
       </w:r>
       <w:r>
         <w:rPr>
@@ -874,7 +874,35 @@
           <w:sz w:val="24"/>
           <w:szCs w:val="24"/>
         </w:rPr>
-        <w:t xml:space="preserve"> and telic verbs (Li &amp; Bowerman, 1998). Within this paradigm, J. Liu et al. (2026) found that 3-year-olds accepted non-culminating interpretations of both RVCs and monomorphemic causative verbs, whereas 5-year-olds rejected them for RVCs but rejected them for monomorphemic verbs more often than adults did; the adverbial </w:t>
+        <w:t xml:space="preserve"> and telic verbs (Li &amp; Bowerman, 1998).</w:t>
+      </w:r>
+    </w:p>
+    <w:p>
+      <w:pPr>
+        <w:spacing w:after="0" w:before="0" w:line="480"/>
+        <w:ind w:firstLine="720"/>
+      </w:pPr>
+      <w:r>
+        <w:rPr>
+          <w:rFonts w:ascii="Times New Roman" w:cs="Times New Roman" w:eastAsia="Times New Roman" w:hAnsi="Times New Roman"/>
+          <w:sz w:val="24"/>
+          <w:szCs w:val="24"/>
+        </w:rPr>
+        <w:t xml:space="preserve">For RVCs, this knowledge is largely in place by around 4 to 5 years of age. Chen (2017) tested children with mean ages of 2;6, 3;6, 4;6, and 6;1 and found that the two older groups, like adults, rejected RVCs when the result was not attained, whereas the two younger groups sometimes accepted them. Similarly, J. Liu et al. (2026) found that 3-year-olds accepted non-culminating interpretations of both RVCs and monomorphemic causative verbs, whereas 5-year-olds rejected them for RVCs.</w:t>
+      </w:r>
+    </w:p>
+    <w:p>
+      <w:pPr>
+        <w:spacing w:after="0" w:before="0" w:line="480"/>
+        <w:ind w:firstLine="720"/>
+      </w:pPr>
+      <w:r>
+        <w:rPr>
+          <w:rFonts w:ascii="Times New Roman" w:cs="Times New Roman" w:eastAsia="Times New Roman" w:hAnsi="Times New Roman"/>
+          <w:sz w:val="24"/>
+          <w:szCs w:val="24"/>
+        </w:rPr>
+        <w:t xml:space="preserve">For V1s, development is slower. In Chen’s (2017) study, adults always accepted a V1 when the action was performed without the result, but children in all age groups, including 6-year-olds, often rejected it, as if the V1, like the RVC, entailed the result. J. Liu et al. (2026) likewise found that 5-year-olds rejected monomorphemic causative verbs in such events more often than adults did, although the adverbial </w:t>
       </w:r>
       <w:r>
         <w:rPr>
@@ -892,7 +920,7 @@
           <w:sz w:val="24"/>
           <w:szCs w:val="24"/>
         </w:rPr>
-        <w:t xml:space="preserve"> “several times” increased acceptance of non-culminating interpretations in all age groups. Children have also been reported to interpret simple verbs such as </w:t>
+        <w:t xml:space="preserve"> “several times” increased acceptance in all age groups. Children’s rejections also varied across verbs. In Chen’s (2017) study, </w:t>
       </w:r>
       <w:r>
         <w:rPr>
@@ -910,17 +938,25 @@
           <w:sz w:val="24"/>
           <w:szCs w:val="24"/>
         </w:rPr>
-        <w:t xml:space="preserve"> “close” as entailing a change of state that adults do not require (Chen, 2017).</w:t>
-      </w:r>
-      <w:r>
-        <w:rPr>
-          <w:rFonts w:ascii="Times New Roman" w:cs="Times New Roman" w:eastAsia="Times New Roman" w:hAnsi="Times New Roman"/>
-          <w:sz w:val="24"/>
-          <w:szCs w:val="24"/>
-          <w:highlight w:val="yellow"/>
-          <w:highlightCs w:val="yellow"/>
-        </w:rPr>
-        <w:t xml:space="preserve">⟦待核：Chen 2017 全文中的具体数据与出处（或为 Chen 2005/2008）⟧</w:t>
+        <w:t xml:space="preserve"> “close” and </w:t>
+      </w:r>
+      <w:r>
+        <w:rPr>
+          <w:rFonts w:ascii="Times New Roman" w:cs="Times New Roman" w:eastAsia="Times New Roman" w:hAnsi="Times New Roman"/>
+          <w:i/>
+          <w:iCs/>
+          <w:sz w:val="24"/>
+          <w:szCs w:val="24"/>
+        </w:rPr>
+        <w:t xml:space="preserve">zhāi</w:t>
+      </w:r>
+      <w:r>
+        <w:rPr>
+          <w:rFonts w:ascii="Times New Roman" w:cs="Times New Roman" w:eastAsia="Times New Roman" w:hAnsi="Times New Roman"/>
+          <w:sz w:val="24"/>
+          <w:szCs w:val="24"/>
+        </w:rPr>
+        <w:t xml:space="preserve"> “pick” were accepted less often than the six other V1s tested, and in an adult rating study reported in the same paper, these two verbs were also the least acceptable with a clause cancelling the result. Chen attributed children’s verb differences to sensitivity to the strength of the state-change implicature.</w:t>
       </w:r>
     </w:p>
     <w:p>
@@ -934,7 +970,7 @@
           <w:sz w:val="24"/>
           <w:szCs w:val="24"/>
         </w:rPr>
-        <w:t xml:space="preserve">These findings indicate that by 5 years of age children appear to distinguish V1s from RVCs, in that they do not require the result for V1 descriptions as consistently as for RVC descriptions, but that their judgments of V1 descriptions remain stricter than adults’. Two questions remain open. First, it is not known whether 4-year-olds, who fall between the age groups tested by J. Liu et al. (2026), already distinguish the two forms. Second, previous studies have not asked whether children’s stricter judgments of V1 descriptions depend on how strongly the action is associated with the result. If they do, children should reject V1 descriptions of zero-result events more often when the V1 is strongly associated with the target result than when it is weakly associated with it. Because acceptance is a binary judgment, it can show whether children’s interpretation of V1s varies with action–result association, but not whether a rejection reflects an inference that the result occurred, a judgment that a description leaving an expected result unaddressed is inadequate (Katsos &amp; Bishop, 2011; Skordos &amp; Papafragou, 2016), or a judgment that the failed attempt is a poor instance of the action.</w:t>
+        <w:t xml:space="preserve">These findings indicate that by 4 to 5 years of age children distinguish V1s from RVCs, in that they do not require the result for V1 descriptions as consistently as for RVC descriptions, but that their judgments of V1 descriptions remain stricter than adults’. Two questions remain open. First, evidence for 4-year-olds comes from a single group of 10 children (Chen, 2017), and J. Liu et al. (2026) did not test this age. Second, it is unclear what children’s verb differences depend on. In Chen’s (2017) study, each verb was presented with a single object and result (e.g., closing a door, picking an apple), so differences among verbs could not be separated from differences among the depicted action–result relations. If children’s judgments depend on that relation, they should reject V1 descriptions of zero-result events more often when the V1 is strongly associated with the target result than when a V1 acting on the same object is weakly associated with it. Because acceptance is a binary judgment, it can show whether children’s interpretation of V1s varies with action–result association, but not whether a rejection reflects an inference that the result occurred, a judgment that a description leaving an expected result unaddressed is inadequate (Katsos &amp; Bishop, 2011; Skordos &amp; Papafragou, 2016), or a judgment that the failed attempt is a poor instance of the action (see the previous section).</w:t>
       </w:r>
     </w:p>
     <w:p>

</xml_diff>